<commit_message>
Atualização de arquivos de audio e textos
Atualização de narração
Atualização de textos da legenda.
</commit_message>
<xml_diff>
--- a/Source/Text/DescricaoPrediosEVeiculos.docx
+++ b/Source/Text/DescricaoPrediosEVeiculos.docx
@@ -1,7 +1,109 @@
 
 <file path=word/document.xml><?xml version="1.0" encoding="utf-8"?>
-<w:document xmlns:wpc="http://schemas.microsoft.com/office/word/2010/wordprocessingCanvas" xmlns:cx="http://schemas.microsoft.com/office/drawing/2014/chartex" xmlns:cx1="http://schemas.microsoft.com/office/drawing/2015/9/8/chartex" xmlns:cx2="http://schemas.microsoft.com/office/drawing/2015/10/21/chartex" xmlns:cx3="http://schemas.microsoft.com/office/drawing/2016/5/9/chartex" xmlns:cx4="http://schemas.microsoft.com/office/drawing/2016/5/10/chartex" xmlns:cx5="http://schemas.microsoft.com/office/drawing/2016/5/11/chartex" xmlns:cx6="http://schemas.microsoft.com/office/drawing/2016/5/12/chartex" xmlns:cx7="http://schemas.microsoft.com/office/drawing/2016/5/13/chartex" xmlns:cx8="http://schemas.microsoft.com/office/drawing/2016/5/14/chartex" xmlns:mc="http://schemas.openxmlformats.org/markup-compatibility/2006" xmlns:aink="http://schemas.microsoft.com/office/drawing/2016/ink" xmlns:am3d="http://schemas.microsoft.com/office/drawing/2017/model3d" xmlns:o="urn:schemas-microsoft-com:office:office" xmlns:oel="http://schemas.microsoft.com/office/2019/extlst" xmlns:r="http://schemas.openxmlformats.org/officeDocument/2006/relationships" xmlns:m="http://schemas.openxmlformats.org/officeDocument/2006/math" xmlns:v="urn:schemas-microsoft-com:vml" xmlns:wp14="http://schemas.microsoft.com/office/word/2010/wordprocessingDrawing" xmlns:wp="http://schemas.openxmlformats.org/drawingml/2006/wordprocessingDrawing" xmlns:w10="urn:schemas-microsoft-com:office:word" xmlns:w="http://schemas.openxmlformats.org/wordprocessingml/2006/main" xmlns:w14="http://schemas.microsoft.com/office/word/2010/wordml" xmlns:w15="http://schemas.microsoft.com/office/word/2012/wordml" xmlns:w16cex="http://schemas.microsoft.com/office/word/2018/wordml/cex" xmlns:w16cid="http://schemas.microsoft.com/office/word/2016/wordml/cid" xmlns:w16="http://schemas.microsoft.com/office/word/2018/wordml" xmlns:w16du="http://schemas.microsoft.com/office/word/2023/wordml/word16du" xmlns:w16sdtdh="http://schemas.microsoft.com/office/word/2020/wordml/sdtdatahash" xmlns:w16se="http://schemas.microsoft.com/office/word/2015/wordml/symex" xmlns:wpg="http://schemas.microsoft.com/office/word/2010/wordprocessingGroup" xmlns:wpi="http://schemas.microsoft.com/office/word/2010/wordprocessingInk" xmlns:wne="http://schemas.microsoft.com/office/word/2006/wordml" xmlns:wps="http://schemas.microsoft.com/office/word/2010/wordprocessingShape" mc:Ignorable="w14 w15 w16se w16cid w16 w16cex w16sdtdh w16du wp14">
+<w:document xmlns:wpc="http://schemas.microsoft.com/office/word/2010/wordprocessingCanvas" xmlns:cx="http://schemas.microsoft.com/office/drawing/2014/chartex" xmlns:cx1="http://schemas.microsoft.com/office/drawing/2015/9/8/chartex" xmlns:cx2="http://schemas.microsoft.com/office/drawing/2015/10/21/chartex" xmlns:cx3="http://schemas.microsoft.com/office/drawing/2016/5/9/chartex" xmlns:cx4="http://schemas.microsoft.com/office/drawing/2016/5/10/chartex" xmlns:cx5="http://schemas.microsoft.com/office/drawing/2016/5/11/chartex" xmlns:cx6="http://schemas.microsoft.com/office/drawing/2016/5/12/chartex" xmlns:cx7="http://schemas.microsoft.com/office/drawing/2016/5/13/chartex" xmlns:cx8="http://schemas.microsoft.com/office/drawing/2016/5/14/chartex" xmlns:mc="http://schemas.openxmlformats.org/markup-compatibility/2006" xmlns:aink="http://schemas.microsoft.com/office/drawing/2016/ink" xmlns:am3d="http://schemas.microsoft.com/office/drawing/2017/model3d" xmlns:o="urn:schemas-microsoft-com:office:office" xmlns:oel="http://schemas.microsoft.com/office/2019/extlst" xmlns:r="http://schemas.openxmlformats.org/officeDocument/2006/relationships" xmlns:m="http://schemas.openxmlformats.org/officeDocument/2006/math" xmlns:v="urn:schemas-microsoft-com:vml" xmlns:wp14="http://schemas.microsoft.com/office/word/2010/wordprocessingDrawing" xmlns:wp="http://schemas.openxmlformats.org/drawingml/2006/wordprocessingDrawing" xmlns:w10="urn:schemas-microsoft-com:office:word" xmlns:w="http://schemas.openxmlformats.org/wordprocessingml/2006/main" xmlns:w14="http://schemas.microsoft.com/office/word/2010/wordml" xmlns:w15="http://schemas.microsoft.com/office/word/2012/wordml" xmlns:w16cex="http://schemas.microsoft.com/office/word/2018/wordml/cex" xmlns:w16cid="http://schemas.microsoft.com/office/word/2016/wordml/cid" xmlns:w16="http://schemas.microsoft.com/office/word/2018/wordml" xmlns:w16du="http://schemas.microsoft.com/office/word/2023/wordml/word16du" xmlns:w16sdtdh="http://schemas.microsoft.com/office/word/2020/wordml/sdtdatahash" xmlns:w16sdtfl="http://schemas.microsoft.com/office/word/2024/wordml/sdtformatlock" xmlns:w16se="http://schemas.microsoft.com/office/word/2015/wordml/symex" xmlns:wpg="http://schemas.microsoft.com/office/word/2010/wordprocessingGroup" xmlns:wpi="http://schemas.microsoft.com/office/word/2010/wordprocessingInk" xmlns:wne="http://schemas.microsoft.com/office/word/2006/wordml" xmlns:wps="http://schemas.microsoft.com/office/word/2010/wordprocessingShape" mc:Ignorable="w14 w15 w16se w16cid w16 w16cex w16sdtdh w16sdtfl w16du wp14">
   <w:body>
+    <w:p>
+      <w:r>
+        <w:t xml:space="preserve">Utilizando Eleven </w:t>
+      </w:r>
+      <w:proofErr w:type="spellStart"/>
+      <w:r>
+        <w:t>Labs</w:t>
+      </w:r>
+      <w:proofErr w:type="spellEnd"/>
+      <w:r>
+        <w:t xml:space="preserve">: </w:t>
+      </w:r>
+      <w:r>
+        <w:t>https://elevenlabs.io/app/speech-synthesis/text-to-speech</w:t>
+      </w:r>
+    </w:p>
+    <w:p>
+      <w:r>
+        <w:t>Voz: Giovanni (</w:t>
+      </w:r>
+      <w:proofErr w:type="spellStart"/>
+      <w:r>
+        <w:t>Legacy</w:t>
+      </w:r>
+      <w:proofErr w:type="spellEnd"/>
+      <w:r>
+        <w:t>)</w:t>
+      </w:r>
+    </w:p>
+    <w:p>
+      <w:proofErr w:type="spellStart"/>
+      <w:r>
+        <w:t>Speed</w:t>
+      </w:r>
+      <w:proofErr w:type="spellEnd"/>
+      <w:r>
+        <w:t>: 1</w:t>
+      </w:r>
+      <w:r>
+        <w:br/>
+      </w:r>
+      <w:proofErr w:type="spellStart"/>
+      <w:r>
+        <w:t>Stability</w:t>
+      </w:r>
+      <w:proofErr w:type="spellEnd"/>
+      <w:r>
+        <w:t>: 50%</w:t>
+      </w:r>
+      <w:r>
+        <w:br/>
+      </w:r>
+      <w:proofErr w:type="spellStart"/>
+      <w:r>
+        <w:t>Similarity</w:t>
+      </w:r>
+      <w:proofErr w:type="spellEnd"/>
+      <w:r>
+        <w:t>: 73%</w:t>
+      </w:r>
+      <w:r>
+        <w:br/>
+      </w:r>
+      <w:proofErr w:type="spellStart"/>
+      <w:r>
+        <w:t>Exaggeration</w:t>
+      </w:r>
+      <w:proofErr w:type="spellEnd"/>
+      <w:r>
+        <w:t>: 0</w:t>
+      </w:r>
+      <w:r>
+        <w:br/>
+        <w:t xml:space="preserve">Speaker Boot: </w:t>
+      </w:r>
+      <w:proofErr w:type="spellStart"/>
+      <w:r>
+        <w:t>Activated</w:t>
+      </w:r>
+      <w:proofErr w:type="spellEnd"/>
+    </w:p>
+    <w:p>
+      <w:r>
+        <w:t xml:space="preserve">Utilizando </w:t>
+      </w:r>
+      <w:proofErr w:type="spellStart"/>
+      <w:r>
+        <w:t>Audacity</w:t>
+      </w:r>
+      <w:proofErr w:type="spellEnd"/>
+      <w:r>
+        <w:t xml:space="preserve">: </w:t>
+      </w:r>
+      <w:r>
+        <w:t>https://www.audacityteam.org/</w:t>
+      </w:r>
+      <w:r>
+        <w:br/>
+        <w:t>Alteração de TEMPO (entre 10 e 15) variável para adequar ao entendimento e velocidade do passeio.</w:t>
+      </w:r>
+    </w:p>
+    <w:p/>
     <w:p>
       <w:r>
         <w:rPr>
@@ -97,6 +199,7 @@
         <w:rPr>
           <w:noProof/>
         </w:rPr>
+        <w:lastRenderedPageBreak/>
         <w:drawing>
           <wp:inline distT="0" distB="0" distL="0" distR="0" wp14:anchorId="66F528E7" wp14:editId="161A96BE">
             <wp:extent cx="5400040" cy="3036570"/>
@@ -175,18 +278,7 @@
           </w:tcPr>
           <w:p>
             <w:r>
-              <w:t xml:space="preserve">O prédio do Central Hotel foi inaugurado em 1939, com linhas </w:t>
-            </w:r>
-            <w:proofErr w:type="spellStart"/>
-            <w:r>
-              <w:t>art</w:t>
-            </w:r>
-            <w:proofErr w:type="spellEnd"/>
-            <w:r>
-              <w:t xml:space="preserve"> </w:t>
-            </w:r>
-            <w:r>
-              <w:t>déco. Na década de 1940, o Central Café, localizado no térreo do hotel, foi ponto de encontro de intelectuais, jornalistas, artistas e poetas que se reuniam diariamente para conversar.</w:t>
+              <w:t>O Central Hotel de Belém, inaugurado no fim do século XIX, era um dos mais tradicionais da cidade. Localizado no centro histórico, destacou-se durante o ciclo da borracha por sua elegância e clientela influente. Em 1950, ainda operava, embora com prestígio reduzido, preservando sua importância como referência hoteleira e símbolo da Belle Époque amazônica.</w:t>
             </w:r>
           </w:p>
         </w:tc>
@@ -198,7 +290,6 @@
         <w:rPr>
           <w:noProof/>
         </w:rPr>
-        <w:lastRenderedPageBreak/>
         <w:drawing>
           <wp:inline distT="0" distB="0" distL="0" distR="0" wp14:anchorId="5F07816E" wp14:editId="000D3799">
             <wp:extent cx="5400040" cy="3036570"/>
@@ -297,6 +388,7 @@
         <w:rPr>
           <w:noProof/>
         </w:rPr>
+        <w:lastRenderedPageBreak/>
         <w:drawing>
           <wp:inline distT="0" distB="0" distL="0" distR="0" wp14:anchorId="0871BB4E" wp14:editId="6B6A3F0C">
             <wp:extent cx="5398770" cy="3037205"/>
@@ -398,6 +490,225 @@
       </w:tr>
     </w:tbl>
     <w:p/>
+    <w:p>
+      <w:r>
+        <w:rPr>
+          <w:noProof/>
+        </w:rPr>
+        <w:drawing>
+          <wp:inline distT="0" distB="0" distL="0" distR="0" wp14:anchorId="4E81A3E2" wp14:editId="2525973B">
+            <wp:extent cx="5391150" cy="3038475"/>
+            <wp:effectExtent l="0" t="0" r="0" b="9525"/>
+            <wp:docPr id="1243310002" name="Imagem 1" descr="Tela de computador com jogo&#10;&#10;O conteúdo gerado por IA pode estar incorreto."/>
+            <wp:cNvGraphicFramePr>
+              <a:graphicFrameLocks xmlns:a="http://schemas.openxmlformats.org/drawingml/2006/main" noChangeAspect="1"/>
+            </wp:cNvGraphicFramePr>
+            <a:graphic xmlns:a="http://schemas.openxmlformats.org/drawingml/2006/main">
+              <a:graphicData uri="http://schemas.openxmlformats.org/drawingml/2006/picture">
+                <pic:pic xmlns:pic="http://schemas.openxmlformats.org/drawingml/2006/picture">
+                  <pic:nvPicPr>
+                    <pic:cNvPr id="1243310002" name="Imagem 1" descr="Tela de computador com jogo&#10;&#10;O conteúdo gerado por IA pode estar incorreto."/>
+                    <pic:cNvPicPr>
+                      <a:picLocks noChangeAspect="1" noChangeArrowheads="1"/>
+                    </pic:cNvPicPr>
+                  </pic:nvPicPr>
+                  <pic:blipFill>
+                    <a:blip r:embed="rId8" cstate="print">
+                      <a:extLst>
+                        <a:ext uri="{28A0092B-C50C-407E-A947-70E740481C1C}">
+                          <a14:useLocalDpi xmlns:a14="http://schemas.microsoft.com/office/drawing/2010/main" val="0"/>
+                        </a:ext>
+                      </a:extLst>
+                    </a:blip>
+                    <a:srcRect/>
+                    <a:stretch>
+                      <a:fillRect/>
+                    </a:stretch>
+                  </pic:blipFill>
+                  <pic:spPr bwMode="auto">
+                    <a:xfrm>
+                      <a:off x="0" y="0"/>
+                      <a:ext cx="5391150" cy="3038475"/>
+                    </a:xfrm>
+                    <a:prstGeom prst="rect">
+                      <a:avLst/>
+                    </a:prstGeom>
+                    <a:noFill/>
+                    <a:ln>
+                      <a:noFill/>
+                    </a:ln>
+                  </pic:spPr>
+                </pic:pic>
+              </a:graphicData>
+            </a:graphic>
+          </wp:inline>
+        </w:drawing>
+      </w:r>
+    </w:p>
+    <w:tbl>
+      <w:tblPr>
+        <w:tblStyle w:val="Tabelacomgrade"/>
+        <w:tblW w:w="0" w:type="auto"/>
+        <w:tblLook w:val="04A0" w:firstRow="1" w:lastRow="0" w:firstColumn="1" w:lastColumn="0" w:noHBand="0" w:noVBand="1"/>
+      </w:tblPr>
+      <w:tblGrid>
+        <w:gridCol w:w="8494"/>
+      </w:tblGrid>
+      <w:tr>
+        <w:tc>
+          <w:tcPr>
+            <w:tcW w:w="8494" w:type="dxa"/>
+          </w:tcPr>
+          <w:p>
+            <w:r>
+              <w:t>CDP – Companhia de Docas do Pará</w:t>
+            </w:r>
+          </w:p>
+        </w:tc>
+      </w:tr>
+      <w:tr>
+        <w:tc>
+          <w:tcPr>
+            <w:tcW w:w="8494" w:type="dxa"/>
+          </w:tcPr>
+          <w:p>
+            <w:r>
+              <w:t>Em 1950, o</w:t>
+            </w:r>
+            <w:r>
+              <w:t xml:space="preserve"> prédio da</w:t>
+            </w:r>
+            <w:r>
+              <w:t xml:space="preserve"> Companhia de Docas do Pará</w:t>
+            </w:r>
+            <w:r>
+              <w:t xml:space="preserve"> ainda operava como sede administrativa da companhia e era um dos marcos do centro portuário da cidade. Sua arquitetura imponente, com janelas altas, fachadas ornamentadas e presença estratégica à beira do rio, representava o legado do auge econômico da Amazônia no início do século XX.</w:t>
+            </w:r>
+          </w:p>
+        </w:tc>
+      </w:tr>
+    </w:tbl>
+    <w:p/>
+    <w:p/>
+    <w:p>
+      <w:r>
+        <w:rPr>
+          <w:noProof/>
+        </w:rPr>
+        <w:drawing>
+          <wp:inline distT="0" distB="0" distL="0" distR="0" wp14:anchorId="5ECFB81A" wp14:editId="7145FDC6">
+            <wp:extent cx="5391150" cy="3038475"/>
+            <wp:effectExtent l="0" t="0" r="0" b="9525"/>
+            <wp:docPr id="1770602452" name="Imagem 2" descr="Interface gráfica do usuário, Site&#10;&#10;O conteúdo gerado por IA pode estar incorreto."/>
+            <wp:cNvGraphicFramePr>
+              <a:graphicFrameLocks xmlns:a="http://schemas.openxmlformats.org/drawingml/2006/main" noChangeAspect="1"/>
+            </wp:cNvGraphicFramePr>
+            <a:graphic xmlns:a="http://schemas.openxmlformats.org/drawingml/2006/main">
+              <a:graphicData uri="http://schemas.openxmlformats.org/drawingml/2006/picture">
+                <pic:pic xmlns:pic="http://schemas.openxmlformats.org/drawingml/2006/picture">
+                  <pic:nvPicPr>
+                    <pic:cNvPr id="1770602452" name="Imagem 2" descr="Interface gráfica do usuário, Site&#10;&#10;O conteúdo gerado por IA pode estar incorreto."/>
+                    <pic:cNvPicPr>
+                      <a:picLocks noChangeAspect="1" noChangeArrowheads="1"/>
+                    </pic:cNvPicPr>
+                  </pic:nvPicPr>
+                  <pic:blipFill>
+                    <a:blip r:embed="rId9" cstate="print">
+                      <a:extLst>
+                        <a:ext uri="{28A0092B-C50C-407E-A947-70E740481C1C}">
+                          <a14:useLocalDpi xmlns:a14="http://schemas.microsoft.com/office/drawing/2010/main" val="0"/>
+                        </a:ext>
+                      </a:extLst>
+                    </a:blip>
+                    <a:srcRect/>
+                    <a:stretch>
+                      <a:fillRect/>
+                    </a:stretch>
+                  </pic:blipFill>
+                  <pic:spPr bwMode="auto">
+                    <a:xfrm>
+                      <a:off x="0" y="0"/>
+                      <a:ext cx="5391150" cy="3038475"/>
+                    </a:xfrm>
+                    <a:prstGeom prst="rect">
+                      <a:avLst/>
+                    </a:prstGeom>
+                    <a:noFill/>
+                    <a:ln>
+                      <a:noFill/>
+                    </a:ln>
+                  </pic:spPr>
+                </pic:pic>
+              </a:graphicData>
+            </a:graphic>
+          </wp:inline>
+        </w:drawing>
+      </w:r>
+    </w:p>
+    <w:tbl>
+      <w:tblPr>
+        <w:tblStyle w:val="Tabelacomgrade"/>
+        <w:tblW w:w="0" w:type="auto"/>
+        <w:tblLook w:val="04A0" w:firstRow="1" w:lastRow="0" w:firstColumn="1" w:lastColumn="0" w:noHBand="0" w:noVBand="1"/>
+      </w:tblPr>
+      <w:tblGrid>
+        <w:gridCol w:w="8494"/>
+      </w:tblGrid>
+      <w:tr>
+        <w:tc>
+          <w:tcPr>
+            <w:tcW w:w="8494" w:type="dxa"/>
+          </w:tcPr>
+          <w:p>
+            <w:r>
+              <w:t>ACP – Associação Comercial do Pará</w:t>
+            </w:r>
+          </w:p>
+        </w:tc>
+      </w:tr>
+      <w:tr>
+        <w:tc>
+          <w:tcPr>
+            <w:tcW w:w="8494" w:type="dxa"/>
+          </w:tcPr>
+          <w:p>
+            <w:r>
+              <w:t xml:space="preserve">O prédio da </w:t>
+            </w:r>
+            <w:r>
+              <w:t>Associação Comercial do Pará</w:t>
+            </w:r>
+            <w:r>
+              <w:t xml:space="preserve"> </w:t>
+            </w:r>
+            <w:r>
+              <w:t xml:space="preserve">no ano de 1950, </w:t>
+            </w:r>
+            <w:r>
+              <w:t xml:space="preserve">continuava sendo um </w:t>
+            </w:r>
+            <w:r>
+              <w:rPr>
+                <w:b/>
+                <w:bCs/>
+              </w:rPr>
+              <w:t>símbolo da força econômica e organizacional da elite comercial de Belém</w:t>
+            </w:r>
+            <w:r>
+              <w:t>.</w:t>
+            </w:r>
+            <w:r>
+              <w:t xml:space="preserve"> </w:t>
+            </w:r>
+            <w:r>
+              <w:t>Era referência arquitetônica e histórica, já consolidada no centro urbano, e mantinha sua importância como sede de debates e articulações políticas e econômicas da região Norte.</w:t>
+            </w:r>
+          </w:p>
+        </w:tc>
+      </w:tr>
+    </w:tbl>
+    <w:p/>
+    <w:p/>
     <w:sectPr>
       <w:pgSz w:w="11906" w:h="16838"/>
       <w:pgMar w:top="1417" w:right="1701" w:bottom="1417" w:left="1701" w:header="708" w:footer="708" w:gutter="0"/>
@@ -409,7 +720,7 @@
 </file>
 
 <file path=word/styles.xml><?xml version="1.0" encoding="utf-8"?>
-<w:styles xmlns:mc="http://schemas.openxmlformats.org/markup-compatibility/2006" xmlns:r="http://schemas.openxmlformats.org/officeDocument/2006/relationships" xmlns:w="http://schemas.openxmlformats.org/wordprocessingml/2006/main" xmlns:w14="http://schemas.microsoft.com/office/word/2010/wordml" xmlns:w15="http://schemas.microsoft.com/office/word/2012/wordml" xmlns:w16cex="http://schemas.microsoft.com/office/word/2018/wordml/cex" xmlns:w16cid="http://schemas.microsoft.com/office/word/2016/wordml/cid" xmlns:w16="http://schemas.microsoft.com/office/word/2018/wordml" xmlns:w16du="http://schemas.microsoft.com/office/word/2023/wordml/word16du" xmlns:w16sdtdh="http://schemas.microsoft.com/office/word/2020/wordml/sdtdatahash" xmlns:w16se="http://schemas.microsoft.com/office/word/2015/wordml/symex" mc:Ignorable="w14 w15 w16se w16cid w16 w16cex w16sdtdh w16du">
+<w:styles xmlns:mc="http://schemas.openxmlformats.org/markup-compatibility/2006" xmlns:r="http://schemas.openxmlformats.org/officeDocument/2006/relationships" xmlns:w="http://schemas.openxmlformats.org/wordprocessingml/2006/main" xmlns:w14="http://schemas.microsoft.com/office/word/2010/wordml" xmlns:w15="http://schemas.microsoft.com/office/word/2012/wordml" xmlns:w16cex="http://schemas.microsoft.com/office/word/2018/wordml/cex" xmlns:w16cid="http://schemas.microsoft.com/office/word/2016/wordml/cid" xmlns:w16="http://schemas.microsoft.com/office/word/2018/wordml" xmlns:w16du="http://schemas.microsoft.com/office/word/2023/wordml/word16du" xmlns:w16sdtdh="http://schemas.microsoft.com/office/word/2020/wordml/sdtdatahash" xmlns:w16sdtfl="http://schemas.microsoft.com/office/word/2024/wordml/sdtformatlock" xmlns:w16se="http://schemas.microsoft.com/office/word/2015/wordml/symex" mc:Ignorable="w14 w15 w16se w16cid w16 w16cex w16sdtdh w16sdtfl w16du">
   <w:docDefaults>
     <w:rPrDefault>
       <w:rPr>

</xml_diff>